<commit_message>
Barranquita: lluvia anual de las estaciones de llanura (Navarro, Pelejo, Shanusi) en la transposicion
Factor 2.21 (2,375.6 / 1,073.1 mm); P24 T25 = 269.6 mm; I = 467 mm/h. Las cunetas 0.40/0.60 cumplen en todos los tramos.
Memorias hidrologica, descriptiva y de calculo actualizadas.

Co-Authored-By: Claude Opus 5.5 <noreply@anthropic.com>
Claude-Session: https://claude.ai/code/session_0142t8T16igb3VKxUPwnQPq6
</commit_message>
<xml_diff>
--- a/entregables_barranquita/MEMORIA_HIDROLOGICA_DRENAJE_PLUVIAL_IE0590_BARRANQUITA.docx
+++ b/entregables_barranquita/MEMORIA_HIDROLOGICA_DRENAJE_PLUVIAL_IE0590_BARRANQUITA.docx
@@ -7915,7 +7915,7 @@
         <w:rPr>
           <w:i w:val="0"/>
         </w:rPr>
-        <w:t>Barranquita (184 m s. n. m.) se encuentra en la llanura del Caynarachi - Huallaga, con un régimen de lluvias mayor que el de Tarapoto (356 m s. n. m.). En la zona, la estación Pongo de Caynarachi del SENAMHI figura entre las más lluviosas del país (185.2 mm en un día en noviembre de 2023 y 400.1 mm en una semana en enero de 2023). Para no subestimar las lluvias de diseño, la serie de Tarapoto se transpone con la relación de precipitaciones medias anuales (Manual de Hidrología, Hidráulica y Drenaje del MTC, transposición de información pluviométrica):</w:t>
+        <w:t>Barranquita (184 m s. n. m.) se encuentra en la llanura del Caynarachi - Huallaga, con un régimen de lluvias mayor que el de Tarapoto (356 m s. n. m.): las estaciones del SENAMHI de la llanura registran de 2,333 a 2,444 mm al año, más del doble que Tarapoto. Para no subestimar las lluvias de diseño, la serie de Tarapoto se transpone con la relación de precipitaciones medias anuales (Manual de Hidrología, Hidráulica y Drenaje del MTC, transposición de información pluviométrica):</w:t>
       </w:r>
     </w:p>
     <w:p>
@@ -7932,6 +7932,17 @@
     </w:p>
     <w:p>
       <w:pPr>
+        <w:jc w:val="both"/>
+      </w:pPr>
+      <w:r>
+        <w:rPr>
+          <w:i w:val="0"/>
+        </w:rPr>
+        <w:t>La precipitación media anual de Barranquita se obtiene de las estaciones del SENAMHI de la zona, presentadas en el estudio hidrológico del expediente de agua potable, alcantarillado sanitario y unidades básicas de saneamiento del distrito de Barranquita (Municipalidad Distrital de Barranquita). Se adopta el promedio de las estaciones de llanura (Navarro, Pelejo y Shanusi, de 100 a 160 m s. n. m.), de altitud y relieve similares a los del local (184 m s. n. m.). La estación Pongo de Caynarachi se excluye porque está al pie de los cerros, a la salida del pongo, y registra lluvias orográficas mayores que las de la llanura; San Antonio (430 m s. n. m.) pertenece a la provincia de San Martín, fuera de la llanura.</w:t>
+      </w:r>
+    </w:p>
+    <w:p>
+      <w:pPr>
         <w:jc w:val="center"/>
       </w:pPr>
       <w:r>
@@ -7939,7 +7950,793 @@
           <w:b/>
           <w:sz w:val="18"/>
         </w:rPr>
-        <w:t>Tabla N° 04. Factor de transposición</w:t>
+        <w:t>Tabla N° 04. Precipitación total anual de las estaciones de la zona (promedio 2013-2017)</w:t>
+      </w:r>
+    </w:p>
+    <w:tbl>
+      <w:tblPr>
+        <w:tblStyle w:val="TableGrid"/>
+        <w:tblW w:type="dxa" w:w="8731"/>
+        <w:jc w:val="center"/>
+        <w:tblLayout w:type="fixed"/>
+        <w:tblLook w:firstColumn="1" w:firstRow="1" w:lastColumn="0" w:lastRow="0" w:noHBand="0" w:noVBand="1" w:val="04A0"/>
+      </w:tblPr>
+      <w:tblGrid>
+        <w:gridCol w:w="2268"/>
+        <w:gridCol w:w="907"/>
+        <w:gridCol w:w="2154"/>
+        <w:gridCol w:w="1134"/>
+        <w:gridCol w:w="1134"/>
+        <w:gridCol w:w="1134"/>
+      </w:tblGrid>
+      <w:tr>
+        <w:tc>
+          <w:tcPr>
+            <w:tcW w:type="dxa" w:w="2268"/>
+            <w:shd w:val="clear" w:color="auto" w:fill="D9E2F3"/>
+          </w:tcPr>
+          <w:p>
+            <w:pPr>
+              <w:jc w:val="center"/>
+            </w:pPr>
+            <w:r/>
+            <w:r>
+              <w:rPr>
+                <w:b/>
+                <w:sz w:val="16"/>
+              </w:rPr>
+              <w:t>Estación SENAMHI</w:t>
+            </w:r>
+          </w:p>
+        </w:tc>
+        <w:tc>
+          <w:tcPr>
+            <w:tcW w:type="dxa" w:w="907"/>
+            <w:shd w:val="clear" w:color="auto" w:fill="D9E2F3"/>
+          </w:tcPr>
+          <w:p>
+            <w:pPr>
+              <w:jc w:val="center"/>
+            </w:pPr>
+            <w:r/>
+            <w:r>
+              <w:rPr>
+                <w:b/>
+                <w:sz w:val="16"/>
+              </w:rPr>
+              <w:t>Código</w:t>
+            </w:r>
+          </w:p>
+        </w:tc>
+        <w:tc>
+          <w:tcPr>
+            <w:tcW w:type="dxa" w:w="2154"/>
+            <w:shd w:val="clear" w:color="auto" w:fill="D9E2F3"/>
+          </w:tcPr>
+          <w:p>
+            <w:pPr>
+              <w:jc w:val="center"/>
+            </w:pPr>
+            <w:r/>
+            <w:r>
+              <w:rPr>
+                <w:b/>
+                <w:sz w:val="16"/>
+              </w:rPr>
+              <w:t>Provincia / distrito</w:t>
+            </w:r>
+          </w:p>
+        </w:tc>
+        <w:tc>
+          <w:tcPr>
+            <w:tcW w:type="dxa" w:w="1134"/>
+            <w:shd w:val="clear" w:color="auto" w:fill="D9E2F3"/>
+          </w:tcPr>
+          <w:p>
+            <w:pPr>
+              <w:jc w:val="center"/>
+            </w:pPr>
+            <w:r/>
+            <w:r>
+              <w:rPr>
+                <w:b/>
+                <w:sz w:val="16"/>
+              </w:rPr>
+              <w:t>Altitud (m s. n. m.)</w:t>
+            </w:r>
+          </w:p>
+        </w:tc>
+        <w:tc>
+          <w:tcPr>
+            <w:tcW w:type="dxa" w:w="1134"/>
+            <w:shd w:val="clear" w:color="auto" w:fill="D9E2F3"/>
+          </w:tcPr>
+          <w:p>
+            <w:pPr>
+              <w:jc w:val="center"/>
+            </w:pPr>
+            <w:r/>
+            <w:r>
+              <w:rPr>
+                <w:b/>
+                <w:sz w:val="16"/>
+              </w:rPr>
+              <w:t>P anual (mm)</w:t>
+            </w:r>
+          </w:p>
+        </w:tc>
+        <w:tc>
+          <w:tcPr>
+            <w:tcW w:type="dxa" w:w="1134"/>
+            <w:shd w:val="clear" w:color="auto" w:fill="D9E2F3"/>
+          </w:tcPr>
+          <w:p>
+            <w:pPr>
+              <w:jc w:val="center"/>
+            </w:pPr>
+            <w:r/>
+            <w:r>
+              <w:rPr>
+                <w:b/>
+                <w:sz w:val="16"/>
+              </w:rPr>
+              <w:t>Uso</w:t>
+            </w:r>
+          </w:p>
+        </w:tc>
+      </w:tr>
+      <w:tr>
+        <w:tc>
+          <w:tcPr>
+            <w:tcW w:type="dxa" w:w="2268"/>
+          </w:tcPr>
+          <w:p>
+            <w:pPr>
+              <w:jc w:val="left"/>
+            </w:pPr>
+            <w:r/>
+            <w:r>
+              <w:rPr>
+                <w:sz w:val="16"/>
+              </w:rPr>
+              <w:t>San Antonio</w:t>
+            </w:r>
+          </w:p>
+        </w:tc>
+        <w:tc>
+          <w:tcPr>
+            <w:tcW w:type="dxa" w:w="907"/>
+          </w:tcPr>
+          <w:p>
+            <w:pPr>
+              <w:jc w:val="center"/>
+            </w:pPr>
+            <w:r/>
+            <w:r>
+              <w:rPr>
+                <w:sz w:val="16"/>
+              </w:rPr>
+              <w:t>153314</w:t>
+            </w:r>
+          </w:p>
+        </w:tc>
+        <w:tc>
+          <w:tcPr>
+            <w:tcW w:type="dxa" w:w="2154"/>
+          </w:tcPr>
+          <w:p>
+            <w:pPr>
+              <w:jc w:val="left"/>
+            </w:pPr>
+            <w:r/>
+            <w:r>
+              <w:rPr>
+                <w:sz w:val="16"/>
+              </w:rPr>
+              <w:t>San Martin / San Antonio</w:t>
+            </w:r>
+          </w:p>
+        </w:tc>
+        <w:tc>
+          <w:tcPr>
+            <w:tcW w:type="dxa" w:w="1134"/>
+          </w:tcPr>
+          <w:p>
+            <w:pPr>
+              <w:jc w:val="center"/>
+            </w:pPr>
+            <w:r/>
+            <w:r>
+              <w:rPr>
+                <w:sz w:val="16"/>
+              </w:rPr>
+              <w:t>430</w:t>
+            </w:r>
+          </w:p>
+        </w:tc>
+        <w:tc>
+          <w:tcPr>
+            <w:tcW w:type="dxa" w:w="1134"/>
+          </w:tcPr>
+          <w:p>
+            <w:pPr>
+              <w:jc w:val="center"/>
+            </w:pPr>
+            <w:r/>
+            <w:r>
+              <w:rPr>
+                <w:sz w:val="16"/>
+              </w:rPr>
+              <w:t>1,834.84</w:t>
+            </w:r>
+          </w:p>
+        </w:tc>
+        <w:tc>
+          <w:tcPr>
+            <w:tcW w:type="dxa" w:w="1134"/>
+          </w:tcPr>
+          <w:p>
+            <w:pPr>
+              <w:jc w:val="center"/>
+            </w:pPr>
+            <w:r/>
+            <w:r>
+              <w:rPr>
+                <w:sz w:val="16"/>
+              </w:rPr>
+              <w:t>No se usa</w:t>
+            </w:r>
+          </w:p>
+        </w:tc>
+      </w:tr>
+      <w:tr>
+        <w:tc>
+          <w:tcPr>
+            <w:tcW w:type="dxa" w:w="2268"/>
+          </w:tcPr>
+          <w:p>
+            <w:pPr>
+              <w:jc w:val="left"/>
+            </w:pPr>
+            <w:r/>
+            <w:r>
+              <w:rPr>
+                <w:sz w:val="16"/>
+              </w:rPr>
+              <w:t>Pongo de Caynarachi</w:t>
+            </w:r>
+          </w:p>
+        </w:tc>
+        <w:tc>
+          <w:tcPr>
+            <w:tcW w:type="dxa" w:w="907"/>
+          </w:tcPr>
+          <w:p>
+            <w:pPr>
+              <w:jc w:val="center"/>
+            </w:pPr>
+            <w:r/>
+            <w:r>
+              <w:rPr>
+                <w:sz w:val="16"/>
+              </w:rPr>
+              <w:t>003317</w:t>
+            </w:r>
+          </w:p>
+        </w:tc>
+        <w:tc>
+          <w:tcPr>
+            <w:tcW w:type="dxa" w:w="2154"/>
+          </w:tcPr>
+          <w:p>
+            <w:pPr>
+              <w:jc w:val="center"/>
+            </w:pPr>
+            <w:r/>
+            <w:r>
+              <w:rPr>
+                <w:sz w:val="16"/>
+              </w:rPr>
+              <w:t>Lamas / Caynarachi</w:t>
+            </w:r>
+          </w:p>
+        </w:tc>
+        <w:tc>
+          <w:tcPr>
+            <w:tcW w:type="dxa" w:w="1134"/>
+          </w:tcPr>
+          <w:p>
+            <w:pPr>
+              <w:jc w:val="center"/>
+            </w:pPr>
+            <w:r/>
+            <w:r>
+              <w:rPr>
+                <w:sz w:val="16"/>
+              </w:rPr>
+              <w:t>230</w:t>
+            </w:r>
+          </w:p>
+        </w:tc>
+        <w:tc>
+          <w:tcPr>
+            <w:tcW w:type="dxa" w:w="1134"/>
+          </w:tcPr>
+          <w:p>
+            <w:pPr>
+              <w:jc w:val="center"/>
+            </w:pPr>
+            <w:r/>
+            <w:r>
+              <w:rPr>
+                <w:sz w:val="16"/>
+              </w:rPr>
+              <w:t>3,853.16</w:t>
+            </w:r>
+          </w:p>
+        </w:tc>
+        <w:tc>
+          <w:tcPr>
+            <w:tcW w:type="dxa" w:w="1134"/>
+          </w:tcPr>
+          <w:p>
+            <w:pPr>
+              <w:jc w:val="center"/>
+            </w:pPr>
+            <w:r/>
+            <w:r>
+              <w:rPr>
+                <w:sz w:val="16"/>
+              </w:rPr>
+              <w:t>No se usa</w:t>
+            </w:r>
+          </w:p>
+        </w:tc>
+      </w:tr>
+      <w:tr>
+        <w:tc>
+          <w:tcPr>
+            <w:tcW w:type="dxa" w:w="2268"/>
+          </w:tcPr>
+          <w:p>
+            <w:pPr>
+              <w:jc w:val="left"/>
+            </w:pPr>
+            <w:r/>
+            <w:r>
+              <w:rPr>
+                <w:sz w:val="16"/>
+              </w:rPr>
+              <w:t>Navarro</w:t>
+            </w:r>
+          </w:p>
+        </w:tc>
+        <w:tc>
+          <w:tcPr>
+            <w:tcW w:type="dxa" w:w="907"/>
+          </w:tcPr>
+          <w:p>
+            <w:pPr>
+              <w:jc w:val="center"/>
+            </w:pPr>
+            <w:r/>
+            <w:r>
+              <w:rPr>
+                <w:sz w:val="16"/>
+              </w:rPr>
+              <w:t>000386</w:t>
+            </w:r>
+          </w:p>
+        </w:tc>
+        <w:tc>
+          <w:tcPr>
+            <w:tcW w:type="dxa" w:w="2154"/>
+          </w:tcPr>
+          <w:p>
+            <w:pPr>
+              <w:jc w:val="left"/>
+            </w:pPr>
+            <w:r/>
+            <w:r>
+              <w:rPr>
+                <w:sz w:val="16"/>
+              </w:rPr>
+              <w:t>San Martin / Chipurana</w:t>
+            </w:r>
+          </w:p>
+        </w:tc>
+        <w:tc>
+          <w:tcPr>
+            <w:tcW w:type="dxa" w:w="1134"/>
+          </w:tcPr>
+          <w:p>
+            <w:pPr>
+              <w:jc w:val="center"/>
+            </w:pPr>
+            <w:r/>
+            <w:r>
+              <w:rPr>
+                <w:sz w:val="16"/>
+              </w:rPr>
+              <w:t>130</w:t>
+            </w:r>
+          </w:p>
+        </w:tc>
+        <w:tc>
+          <w:tcPr>
+            <w:tcW w:type="dxa" w:w="1134"/>
+          </w:tcPr>
+          <w:p>
+            <w:pPr>
+              <w:jc w:val="center"/>
+            </w:pPr>
+            <w:r/>
+            <w:r>
+              <w:rPr>
+                <w:sz w:val="16"/>
+              </w:rPr>
+              <w:t>2,349.79</w:t>
+            </w:r>
+          </w:p>
+        </w:tc>
+        <w:tc>
+          <w:tcPr>
+            <w:tcW w:type="dxa" w:w="1134"/>
+          </w:tcPr>
+          <w:p>
+            <w:pPr>
+              <w:jc w:val="center"/>
+            </w:pPr>
+            <w:r/>
+            <w:r>
+              <w:rPr>
+                <w:sz w:val="16"/>
+              </w:rPr>
+              <w:t>Se usa</w:t>
+            </w:r>
+          </w:p>
+        </w:tc>
+      </w:tr>
+      <w:tr>
+        <w:tc>
+          <w:tcPr>
+            <w:tcW w:type="dxa" w:w="2268"/>
+          </w:tcPr>
+          <w:p>
+            <w:pPr>
+              <w:jc w:val="left"/>
+            </w:pPr>
+            <w:r/>
+            <w:r>
+              <w:rPr>
+                <w:sz w:val="16"/>
+              </w:rPr>
+              <w:t>Pelejo</w:t>
+            </w:r>
+          </w:p>
+        </w:tc>
+        <w:tc>
+          <w:tcPr>
+            <w:tcW w:type="dxa" w:w="907"/>
+          </w:tcPr>
+          <w:p>
+            <w:pPr>
+              <w:jc w:val="center"/>
+            </w:pPr>
+            <w:r/>
+            <w:r>
+              <w:rPr>
+                <w:sz w:val="16"/>
+              </w:rPr>
+              <w:t>153322</w:t>
+            </w:r>
+          </w:p>
+        </w:tc>
+        <w:tc>
+          <w:tcPr>
+            <w:tcW w:type="dxa" w:w="2154"/>
+          </w:tcPr>
+          <w:p>
+            <w:pPr>
+              <w:jc w:val="left"/>
+            </w:pPr>
+            <w:r/>
+            <w:r>
+              <w:rPr>
+                <w:sz w:val="16"/>
+              </w:rPr>
+              <w:t>San Martin / El Porvenir</w:t>
+            </w:r>
+          </w:p>
+        </w:tc>
+        <w:tc>
+          <w:tcPr>
+            <w:tcW w:type="dxa" w:w="1134"/>
+          </w:tcPr>
+          <w:p>
+            <w:pPr>
+              <w:jc w:val="center"/>
+            </w:pPr>
+            <w:r/>
+            <w:r>
+              <w:rPr>
+                <w:sz w:val="16"/>
+              </w:rPr>
+              <w:t>100</w:t>
+            </w:r>
+          </w:p>
+        </w:tc>
+        <w:tc>
+          <w:tcPr>
+            <w:tcW w:type="dxa" w:w="1134"/>
+          </w:tcPr>
+          <w:p>
+            <w:pPr>
+              <w:jc w:val="center"/>
+            </w:pPr>
+            <w:r/>
+            <w:r>
+              <w:rPr>
+                <w:sz w:val="16"/>
+              </w:rPr>
+              <w:t>2,332.92</w:t>
+            </w:r>
+          </w:p>
+        </w:tc>
+        <w:tc>
+          <w:tcPr>
+            <w:tcW w:type="dxa" w:w="1134"/>
+          </w:tcPr>
+          <w:p>
+            <w:pPr>
+              <w:jc w:val="center"/>
+            </w:pPr>
+            <w:r/>
+            <w:r>
+              <w:rPr>
+                <w:sz w:val="16"/>
+              </w:rPr>
+              <w:t>Se usa</w:t>
+            </w:r>
+          </w:p>
+        </w:tc>
+      </w:tr>
+      <w:tr>
+        <w:tc>
+          <w:tcPr>
+            <w:tcW w:type="dxa" w:w="2268"/>
+          </w:tcPr>
+          <w:p>
+            <w:pPr>
+              <w:jc w:val="left"/>
+            </w:pPr>
+            <w:r/>
+            <w:r>
+              <w:rPr>
+                <w:sz w:val="16"/>
+              </w:rPr>
+              <w:t>Shanusi</w:t>
+            </w:r>
+          </w:p>
+        </w:tc>
+        <w:tc>
+          <w:tcPr>
+            <w:tcW w:type="dxa" w:w="907"/>
+          </w:tcPr>
+          <w:p>
+            <w:pPr>
+              <w:jc w:val="center"/>
+            </w:pPr>
+            <w:r/>
+            <w:r>
+              <w:rPr>
+                <w:sz w:val="16"/>
+              </w:rPr>
+              <w:t>153315</w:t>
+            </w:r>
+          </w:p>
+        </w:tc>
+        <w:tc>
+          <w:tcPr>
+            <w:tcW w:type="dxa" w:w="2154"/>
+          </w:tcPr>
+          <w:p>
+            <w:pPr>
+              <w:jc w:val="left"/>
+            </w:pPr>
+            <w:r/>
+            <w:r>
+              <w:rPr>
+                <w:sz w:val="16"/>
+              </w:rPr>
+              <w:t>Alto Amazonas / Yurimaguas</w:t>
+            </w:r>
+          </w:p>
+        </w:tc>
+        <w:tc>
+          <w:tcPr>
+            <w:tcW w:type="dxa" w:w="1134"/>
+          </w:tcPr>
+          <w:p>
+            <w:pPr>
+              <w:jc w:val="center"/>
+            </w:pPr>
+            <w:r/>
+            <w:r>
+              <w:rPr>
+                <w:sz w:val="16"/>
+              </w:rPr>
+              <w:t>160</w:t>
+            </w:r>
+          </w:p>
+        </w:tc>
+        <w:tc>
+          <w:tcPr>
+            <w:tcW w:type="dxa" w:w="1134"/>
+          </w:tcPr>
+          <w:p>
+            <w:pPr>
+              <w:jc w:val="center"/>
+            </w:pPr>
+            <w:r/>
+            <w:r>
+              <w:rPr>
+                <w:sz w:val="16"/>
+              </w:rPr>
+              <w:t>2,444.00</w:t>
+            </w:r>
+          </w:p>
+        </w:tc>
+        <w:tc>
+          <w:tcPr>
+            <w:tcW w:type="dxa" w:w="1134"/>
+          </w:tcPr>
+          <w:p>
+            <w:pPr>
+              <w:jc w:val="center"/>
+            </w:pPr>
+            <w:r/>
+            <w:r>
+              <w:rPr>
+                <w:sz w:val="16"/>
+              </w:rPr>
+              <w:t>Se usa</w:t>
+            </w:r>
+          </w:p>
+        </w:tc>
+      </w:tr>
+      <w:tr>
+        <w:tc>
+          <w:tcPr>
+            <w:tcW w:type="dxa" w:w="2268"/>
+            <w:shd w:val="clear" w:color="auto" w:fill="F2F2F2"/>
+          </w:tcPr>
+          <w:p>
+            <w:pPr>
+              <w:jc w:val="left"/>
+            </w:pPr>
+            <w:r/>
+            <w:r>
+              <w:rPr>
+                <w:b/>
+                <w:sz w:val="16"/>
+              </w:rPr>
+              <w:t>Promedio adoptado (Navarro, Pelejo y Shanusi)</w:t>
+            </w:r>
+          </w:p>
+        </w:tc>
+        <w:tc>
+          <w:tcPr>
+            <w:tcW w:type="dxa" w:w="907"/>
+            <w:shd w:val="clear" w:color="auto" w:fill="F2F2F2"/>
+          </w:tcPr>
+          <w:p>
+            <w:pPr>
+              <w:jc w:val="center"/>
+            </w:pPr>
+            <w:r/>
+            <w:r>
+              <w:rPr>
+                <w:b/>
+                <w:sz w:val="16"/>
+              </w:rPr>
+            </w:r>
+          </w:p>
+        </w:tc>
+        <w:tc>
+          <w:tcPr>
+            <w:tcW w:type="dxa" w:w="2154"/>
+            <w:shd w:val="clear" w:color="auto" w:fill="F2F2F2"/>
+          </w:tcPr>
+          <w:p>
+            <w:pPr>
+              <w:jc w:val="center"/>
+            </w:pPr>
+            <w:r/>
+            <w:r>
+              <w:rPr>
+                <w:b/>
+                <w:sz w:val="16"/>
+              </w:rPr>
+            </w:r>
+          </w:p>
+        </w:tc>
+        <w:tc>
+          <w:tcPr>
+            <w:tcW w:type="dxa" w:w="1134"/>
+            <w:shd w:val="clear" w:color="auto" w:fill="F2F2F2"/>
+          </w:tcPr>
+          <w:p>
+            <w:pPr>
+              <w:jc w:val="center"/>
+            </w:pPr>
+            <w:r/>
+            <w:r>
+              <w:rPr>
+                <w:b/>
+                <w:sz w:val="16"/>
+              </w:rPr>
+            </w:r>
+          </w:p>
+        </w:tc>
+        <w:tc>
+          <w:tcPr>
+            <w:tcW w:type="dxa" w:w="1134"/>
+            <w:shd w:val="clear" w:color="auto" w:fill="F2F2F2"/>
+          </w:tcPr>
+          <w:p>
+            <w:pPr>
+              <w:jc w:val="center"/>
+            </w:pPr>
+            <w:r/>
+            <w:r>
+              <w:rPr>
+                <w:b/>
+                <w:sz w:val="16"/>
+              </w:rPr>
+              <w:t>2,375.57</w:t>
+            </w:r>
+          </w:p>
+        </w:tc>
+        <w:tc>
+          <w:tcPr>
+            <w:tcW w:type="dxa" w:w="1134"/>
+            <w:shd w:val="clear" w:color="auto" w:fill="F2F2F2"/>
+          </w:tcPr>
+          <w:p>
+            <w:pPr>
+              <w:jc w:val="center"/>
+            </w:pPr>
+            <w:r/>
+            <w:r>
+              <w:rPr>
+                <w:b/>
+                <w:sz w:val="16"/>
+              </w:rPr>
+            </w:r>
+          </w:p>
+        </w:tc>
+      </w:tr>
+    </w:tbl>
+    <w:p>
+      <w:r>
+        <w:rPr>
+          <w:i/>
+          <w:sz w:val="16"/>
+        </w:rPr>
+        <w:t>Fuente: Estudio hidrológico, Cuadro N° 05, expediente de agua potable y alcantarillado sanitario del distrito de Barranquita (SENAMHI, 2013-2017).</w:t>
+      </w:r>
+    </w:p>
+    <w:p>
+      <w:pPr>
+        <w:jc w:val="center"/>
+      </w:pPr>
+      <w:r>
+        <w:rPr>
+          <w:b/>
+          <w:sz w:val="18"/>
+        </w:rPr>
+        <w:t>Tabla N° 05. Factor de transposición</w:t>
       </w:r>
     </w:p>
     <w:tbl>
@@ -8081,7 +8878,7 @@
               <w:rPr>
                 <w:sz w:val="17"/>
               </w:rPr>
-              <w:t>Precipitación media anual en la llanura del Caynarachi - Huallaga (Pa)</w:t>
+              <w:t>Precipitación media anual en la llanura de Barranquita (Pa)</w:t>
             </w:r>
           </w:p>
         </w:tc>
@@ -8098,7 +8895,7 @@
               <w:rPr>
                 <w:sz w:val="17"/>
               </w:rPr>
-              <w:t>2,039.6 mm</w:t>
+              <w:t>2,375.6 mm</w:t>
             </w:r>
           </w:p>
         </w:tc>
@@ -8115,7 +8912,7 @@
               <w:rPr>
                 <w:sz w:val="17"/>
               </w:rPr>
-              <w:t>SENAMHI, estación Yurimaguas (184 m s. n. m.); dentro del rango 1,800 - 2,400 mm de la memoria de arquitectura</w:t>
+              <w:t>Promedio de las estaciones de llanura Navarro, Pelejo y Shanusi (SENAMHI, 2013-2017)</w:t>
             </w:r>
           </w:p>
         </w:tc>
@@ -8151,7 +8948,7 @@
               <w:rPr>
                 <w:sz w:val="17"/>
               </w:rPr>
-              <w:t>1.9007</w:t>
+              <w:t>2.2137</w:t>
             </w:r>
           </w:p>
         </w:tc>
@@ -8180,7 +8977,7 @@
           <w:i/>
           <w:sz w:val="16"/>
         </w:rPr>
-        <w:t>Fuente: Precipitacion media anual de las estaciones Tarapoto (1,073.1 mm) y Yurimaguas (2,039.6 mm), datos SENAMHI reportados en la Disertacion de Maestria USP (teses.usp.br, tde-20191218-125548); rango 1,800 - 2,400 mm/ano de la memoria descriptiva de arquitectura del proyecto.</w:t>
+        <w:t>Fuente: Tarapoto: precipitacion media anual de 1,073.1 mm (SENAMHI). Barranquita: promedio de las estaciones de llanura Navarro, Pelejo y Shanusi (SENAMHI, 2013-2017), Cuadro N° 05 del estudio hidrologico del expediente de agua potable y alcantarillado sanitario del distrito de Barranquita (Municipalidad Distrital de Barranquita).</w:t>
       </w:r>
     </w:p>
     <w:p>
@@ -8259,7 +9056,7 @@
           <w:b/>
           <w:sz w:val="18"/>
         </w:rPr>
-        <w:t>Tabla N° 05. Parámetros de la serie transpuesta</w:t>
+        <w:t>Tabla N° 06. Parámetros de la serie transpuesta</w:t>
       </w:r>
     </w:p>
     <w:tbl>
@@ -8381,7 +9178,7 @@
               <w:rPr>
                 <w:sz w:val="17"/>
               </w:rPr>
-              <w:t>150.83</w:t>
+              <w:t>175.67</w:t>
             </w:r>
           </w:p>
         </w:tc>
@@ -8417,7 +9214,7 @@
               <w:rPr>
                 <w:sz w:val="17"/>
               </w:rPr>
-              <w:t>41.94</w:t>
+              <w:t>48.85</w:t>
             </w:r>
           </w:p>
         </w:tc>
@@ -8489,7 +9286,7 @@
               <w:rPr>
                 <w:sz w:val="17"/>
               </w:rPr>
-              <w:t>2.1636</w:t>
+              <w:t>2.2299</w:t>
             </w:r>
           </w:p>
         </w:tc>
@@ -8525,7 +9322,7 @@
               <w:rPr>
                 <w:sz w:val="17"/>
               </w:rPr>
-              <w:t>0.1148</w:t>
+              <w:t>0.1147</w:t>
             </w:r>
           </w:p>
         </w:tc>
@@ -8561,7 +9358,7 @@
               <w:rPr>
                 <w:sz w:val="17"/>
               </w:rPr>
-              <w:t>0.1563</w:t>
+              <w:t>0.1564</w:t>
             </w:r>
           </w:p>
         </w:tc>
@@ -8636,7 +9433,7 @@
           <w:b/>
           <w:sz w:val="18"/>
         </w:rPr>
-        <w:t>Tabla N° 06. Precipitación máxima en 24 h por periodo de retorno, serie transpuesta (mm)</w:t>
+        <w:t>Tabla N° 07. Precipitación máxima en 24 h por periodo de retorno, serie transpuesta (mm)</w:t>
       </w:r>
     </w:p>
     <w:tbl>
@@ -8782,7 +9579,7 @@
               <w:rPr>
                 <w:sz w:val="17"/>
               </w:rPr>
-              <w:t>150.83</w:t>
+              <w:t>175.67</w:t>
             </w:r>
           </w:p>
         </w:tc>
@@ -8799,7 +9596,7 @@
               <w:rPr>
                 <w:sz w:val="17"/>
               </w:rPr>
-              <w:t>145.76</w:t>
+              <w:t>169.77</w:t>
             </w:r>
           </w:p>
         </w:tc>
@@ -8816,7 +9613,7 @@
               <w:rPr>
                 <w:sz w:val="17"/>
               </w:rPr>
-              <w:t>144.76</w:t>
+              <w:t>168.61</w:t>
             </w:r>
           </w:p>
         </w:tc>
@@ -8833,7 +9630,7 @@
               <w:rPr>
                 <w:sz w:val="17"/>
               </w:rPr>
-              <w:t>143.93</w:t>
+              <w:t>167.64</w:t>
             </w:r>
           </w:p>
         </w:tc>
@@ -8869,7 +9666,7 @@
               <w:rPr>
                 <w:sz w:val="17"/>
               </w:rPr>
-              <w:t>186.13</w:t>
+              <w:t>216.79</w:t>
             </w:r>
           </w:p>
         </w:tc>
@@ -8886,7 +9683,7 @@
               <w:rPr>
                 <w:sz w:val="17"/>
               </w:rPr>
-              <w:t>182.06</w:t>
+              <w:t>212.05</w:t>
             </w:r>
           </w:p>
         </w:tc>
@@ -8903,7 +9700,7 @@
               <w:rPr>
                 <w:sz w:val="17"/>
               </w:rPr>
-              <w:t>181.65</w:t>
+              <w:t>211.57</w:t>
             </w:r>
           </w:p>
         </w:tc>
@@ -8920,7 +9717,7 @@
               <w:rPr>
                 <w:sz w:val="17"/>
               </w:rPr>
-              <w:t>181.00</w:t>
+              <w:t>210.82</w:t>
             </w:r>
           </w:p>
         </w:tc>
@@ -8956,7 +9753,7 @@
               <w:rPr>
                 <w:sz w:val="17"/>
               </w:rPr>
-              <w:t>204.58</w:t>
+              <w:t>238.28</w:t>
             </w:r>
           </w:p>
         </w:tc>
@@ -8973,7 +9770,7 @@
               <w:rPr>
                 <w:sz w:val="17"/>
               </w:rPr>
-              <w:t>204.51</w:t>
+              <w:t>238.19</w:t>
             </w:r>
           </w:p>
         </w:tc>
@@ -8990,7 +9787,7 @@
               <w:rPr>
                 <w:sz w:val="17"/>
               </w:rPr>
-              <w:t>205.34</w:t>
+              <w:t>239.17</w:t>
             </w:r>
           </w:p>
         </w:tc>
@@ -9007,7 +9804,7 @@
               <w:rPr>
                 <w:sz w:val="17"/>
               </w:rPr>
-              <w:t>205.54</w:t>
+              <w:t>239.40</w:t>
             </w:r>
           </w:p>
         </w:tc>
@@ -9043,7 +9840,7 @@
               <w:rPr>
                 <w:sz w:val="17"/>
               </w:rPr>
-              <w:t>219.82</w:t>
+              <w:t>256.03</w:t>
             </w:r>
           </w:p>
         </w:tc>
@@ -9060,7 +9857,7 @@
               <w:rPr>
                 <w:sz w:val="17"/>
               </w:rPr>
-              <w:t>225.11</w:t>
+              <w:t>262.19</w:t>
             </w:r>
           </w:p>
         </w:tc>
@@ -9077,7 +9874,7 @@
               <w:rPr>
                 <w:sz w:val="17"/>
               </w:rPr>
-              <w:t>227.69</w:t>
+              <w:t>265.20</w:t>
             </w:r>
           </w:p>
         </w:tc>
@@ -9094,7 +9891,7 @@
               <w:rPr>
                 <w:sz w:val="17"/>
               </w:rPr>
-              <w:t>229.09</w:t>
+              <w:t>266.82</w:t>
             </w:r>
           </w:p>
         </w:tc>
@@ -9130,7 +9927,7 @@
               <w:rPr>
                 <w:sz w:val="17"/>
               </w:rPr>
-              <w:t>224.26</w:t>
+              <w:t>261.20</w:t>
             </w:r>
           </w:p>
         </w:tc>
@@ -9147,7 +9944,7 @@
               <w:rPr>
                 <w:sz w:val="17"/>
               </w:rPr>
-              <w:t>231.49</w:t>
+              <w:t>269.62</w:t>
             </w:r>
           </w:p>
         </w:tc>
@@ -9164,7 +9961,7 @@
               <w:rPr>
                 <w:sz w:val="17"/>
               </w:rPr>
-              <w:t>234.73</w:t>
+              <w:t>273.40</w:t>
             </w:r>
           </w:p>
         </w:tc>
@@ -9181,7 +9978,7 @@
               <w:rPr>
                 <w:sz w:val="17"/>
               </w:rPr>
-              <w:t>236.55</w:t>
+              <w:t>275.52</w:t>
             </w:r>
           </w:p>
         </w:tc>
@@ -9217,7 +10014,7 @@
               <w:rPr>
                 <w:sz w:val="17"/>
               </w:rPr>
-              <w:t>236.97</w:t>
+              <w:t>276.00</w:t>
             </w:r>
           </w:p>
         </w:tc>
@@ -9234,7 +10031,7 @@
               <w:rPr>
                 <w:sz w:val="17"/>
               </w:rPr>
-              <w:t>250.79</w:t>
+              <w:t>292.10</w:t>
             </w:r>
           </w:p>
         </w:tc>
@@ -9251,7 +10048,7 @@
               <w:rPr>
                 <w:sz w:val="17"/>
               </w:rPr>
-              <w:t>256.35</w:t>
+              <w:t>298.58</w:t>
             </w:r>
           </w:p>
         </w:tc>
@@ -9268,7 +10065,7 @@
               <w:rPr>
                 <w:sz w:val="17"/>
               </w:rPr>
-              <w:t>259.56</w:t>
+              <w:t>302.31</w:t>
             </w:r>
           </w:p>
         </w:tc>
@@ -9304,7 +10101,7 @@
               <w:rPr>
                 <w:sz w:val="17"/>
               </w:rPr>
-              <w:t>248.40</w:t>
+              <w:t>289.32</w:t>
             </w:r>
           </w:p>
         </w:tc>
@@ -9321,7 +10118,7 @@
               <w:rPr>
                 <w:sz w:val="17"/>
               </w:rPr>
-              <w:t>269.52</w:t>
+              <w:t>313.92</w:t>
             </w:r>
           </w:p>
         </w:tc>
@@ -9338,7 +10135,7 @@
               <w:rPr>
                 <w:sz w:val="17"/>
               </w:rPr>
-              <w:t>277.80</w:t>
+              <w:t>323.57</w:t>
             </w:r>
           </w:p>
         </w:tc>
@@ -9355,7 +10152,7 @@
               <w:rPr>
                 <w:sz w:val="17"/>
               </w:rPr>
-              <w:t>282.39</w:t>
+              <w:t>328.91</w:t>
             </w:r>
           </w:p>
         </w:tc>
@@ -9391,7 +10188,7 @@
               <w:rPr>
                 <w:sz w:val="17"/>
               </w:rPr>
-              <w:t>258.87</w:t>
+              <w:t>301.51</w:t>
             </w:r>
           </w:p>
         </w:tc>
@@ -9408,7 +10205,7 @@
               <w:rPr>
                 <w:sz w:val="17"/>
               </w:rPr>
-              <w:t>287.89</w:t>
+              <w:t>335.31</w:t>
             </w:r>
           </w:p>
         </w:tc>
@@ -9425,7 +10222,7 @@
               <w:rPr>
                 <w:sz w:val="17"/>
               </w:rPr>
-              <w:t>299.29</w:t>
+              <w:t>348.60</w:t>
             </w:r>
           </w:p>
         </w:tc>
@@ -9442,7 +10239,7 @@
               <w:rPr>
                 <w:sz w:val="17"/>
               </w:rPr>
-              <w:t>305.14</w:t>
+              <w:t>355.41</w:t>
             </w:r>
           </w:p>
         </w:tc>
@@ -9478,7 +10275,7 @@
               <w:rPr>
                 <w:sz w:val="17"/>
               </w:rPr>
-              <w:t>271.55</w:t>
+              <w:t>316.28</w:t>
             </w:r>
           </w:p>
         </w:tc>
@@ -9495,7 +10292,7 @@
               <w:rPr>
                 <w:sz w:val="17"/>
               </w:rPr>
-              <w:t>311.83</w:t>
+              <w:t>363.19</w:t>
             </w:r>
           </w:p>
         </w:tc>
@@ -9512,7 +10309,7 @@
               <w:rPr>
                 <w:sz w:val="17"/>
               </w:rPr>
-              <w:t>327.98</w:t>
+              <w:t>382.02</w:t>
             </w:r>
           </w:p>
         </w:tc>
@@ -9529,7 +10326,7 @@
               <w:rPr>
                 <w:sz w:val="17"/>
               </w:rPr>
-              <w:t>335.16</w:t>
+              <w:t>390.37</w:t>
             </w:r>
           </w:p>
         </w:tc>
@@ -9568,7 +10365,7 @@
           <w:b/>
           <w:sz w:val="18"/>
         </w:rPr>
-        <w:t>Tabla N° 07. Prueba de Kolmogorov-Smirnov</w:t>
+        <w:t>Tabla N° 08. Prueba de Kolmogorov-Smirnov</w:t>
       </w:r>
     </w:p>
     <w:tbl>
@@ -10059,7 +10856,7 @@
           <w:b/>
           <w:sz w:val="18"/>
         </w:rPr>
-        <w:t>Tabla N° 08. Intensidades máximas (mm/h)</w:t>
+        <w:t>Tabla N° 09. Intensidades máximas (mm/h)</w:t>
       </w:r>
     </w:p>
     <w:tbl>
@@ -10245,7 +11042,7 @@
               <w:rPr>
                 <w:sz w:val="17"/>
               </w:rPr>
-              <w:t>424.6</w:t>
+              <w:t>494.5</w:t>
             </w:r>
           </w:p>
         </w:tc>
@@ -10262,7 +11059,7 @@
               <w:rPr>
                 <w:sz w:val="17"/>
               </w:rPr>
-              <w:t>530.3</w:t>
+              <w:t>617.7</w:t>
             </w:r>
           </w:p>
         </w:tc>
@@ -10279,7 +11076,7 @@
               <w:rPr>
                 <w:sz w:val="17"/>
               </w:rPr>
-              <w:t>595.7</w:t>
+              <w:t>693.8</w:t>
             </w:r>
           </w:p>
         </w:tc>
@@ -10296,7 +11093,7 @@
               <w:rPr>
                 <w:sz w:val="17"/>
               </w:rPr>
-              <w:t>674.3</w:t>
+              <w:t>785.4</w:t>
             </w:r>
           </w:p>
         </w:tc>
@@ -10313,7 +11110,7 @@
               <w:rPr>
                 <w:sz w:val="17"/>
               </w:rPr>
-              <w:t>730.6</w:t>
+              <w:t>850.9</w:t>
             </w:r>
           </w:p>
         </w:tc>
@@ -10330,7 +11127,7 @@
               <w:rPr>
                 <w:sz w:val="17"/>
               </w:rPr>
-              <w:t>785.1</w:t>
+              <w:t>914.4</w:t>
             </w:r>
           </w:p>
         </w:tc>
@@ -10366,7 +11163,7 @@
               <w:rPr>
                 <w:sz w:val="17"/>
               </w:rPr>
-              <w:t>252.5</w:t>
+              <w:t>294.1</w:t>
             </w:r>
           </w:p>
         </w:tc>
@@ -10383,7 +11180,7 @@
               <w:rPr>
                 <w:sz w:val="17"/>
               </w:rPr>
-              <w:t>315.3</w:t>
+              <w:t>367.3</w:t>
             </w:r>
           </w:p>
         </w:tc>
@@ -10400,7 +11197,7 @@
               <w:rPr>
                 <w:sz w:val="17"/>
               </w:rPr>
-              <w:t>354.2</w:t>
+              <w:t>412.6</w:t>
             </w:r>
           </w:p>
         </w:tc>
@@ -10417,7 +11214,7 @@
               <w:rPr>
                 <w:sz w:val="17"/>
               </w:rPr>
-              <w:t>401.0</w:t>
+              <w:t>467.0</w:t>
             </w:r>
           </w:p>
         </w:tc>
@@ -10434,7 +11231,7 @@
               <w:rPr>
                 <w:sz w:val="17"/>
               </w:rPr>
-              <w:t>434.4</w:t>
+              <w:t>505.9</w:t>
             </w:r>
           </w:p>
         </w:tc>
@@ -10451,7 +11248,7 @@
               <w:rPr>
                 <w:sz w:val="17"/>
               </w:rPr>
-              <w:t>466.8</w:t>
+              <w:t>543.7</w:t>
             </w:r>
           </w:p>
         </w:tc>
@@ -10487,7 +11284,7 @@
               <w:rPr>
                 <w:sz w:val="17"/>
               </w:rPr>
-              <w:t>186.3</w:t>
+              <w:t>217.0</w:t>
             </w:r>
           </w:p>
         </w:tc>
@@ -10504,7 +11301,7 @@
               <w:rPr>
                 <w:sz w:val="17"/>
               </w:rPr>
-              <w:t>232.7</w:t>
+              <w:t>271.0</w:t>
             </w:r>
           </w:p>
         </w:tc>
@@ -10521,7 +11318,7 @@
               <w:rPr>
                 <w:sz w:val="17"/>
               </w:rPr>
-              <w:t>261.3</w:t>
+              <w:t>304.4</w:t>
             </w:r>
           </w:p>
         </w:tc>
@@ -10538,7 +11335,7 @@
               <w:rPr>
                 <w:sz w:val="17"/>
               </w:rPr>
-              <w:t>295.8</w:t>
+              <w:t>344.5</w:t>
             </w:r>
           </w:p>
         </w:tc>
@@ -10555,7 +11352,7 @@
               <w:rPr>
                 <w:sz w:val="17"/>
               </w:rPr>
-              <w:t>320.5</w:t>
+              <w:t>373.3</w:t>
             </w:r>
           </w:p>
         </w:tc>
@@ -10572,7 +11369,7 @@
               <w:rPr>
                 <w:sz w:val="17"/>
               </w:rPr>
-              <w:t>344.4</w:t>
+              <w:t>401.2</w:t>
             </w:r>
           </w:p>
         </w:tc>
@@ -10608,7 +11405,7 @@
               <w:rPr>
                 <w:sz w:val="17"/>
               </w:rPr>
-              <w:t>150.1</w:t>
+              <w:t>174.8</w:t>
             </w:r>
           </w:p>
         </w:tc>
@@ -10625,7 +11422,7 @@
               <w:rPr>
                 <w:sz w:val="17"/>
               </w:rPr>
-              <w:t>187.5</w:t>
+              <w:t>218.4</w:t>
             </w:r>
           </w:p>
         </w:tc>
@@ -10642,7 +11439,7 @@
               <w:rPr>
                 <w:sz w:val="17"/>
               </w:rPr>
-              <w:t>210.6</w:t>
+              <w:t>245.3</w:t>
             </w:r>
           </w:p>
         </w:tc>
@@ -10659,7 +11456,7 @@
               <w:rPr>
                 <w:sz w:val="17"/>
               </w:rPr>
-              <w:t>238.4</w:t>
+              <w:t>277.7</w:t>
             </w:r>
           </w:p>
         </w:tc>
@@ -10676,7 +11473,7 @@
               <w:rPr>
                 <w:sz w:val="17"/>
               </w:rPr>
-              <w:t>258.3</w:t>
+              <w:t>300.8</w:t>
             </w:r>
           </w:p>
         </w:tc>
@@ -10693,7 +11490,7 @@
               <w:rPr>
                 <w:sz w:val="17"/>
               </w:rPr>
-              <w:t>277.6</w:t>
+              <w:t>323.3</w:t>
             </w:r>
           </w:p>
         </w:tc>
@@ -10729,7 +11526,7 @@
               <w:rPr>
                 <w:sz w:val="17"/>
               </w:rPr>
-              <w:t>110.8</w:t>
+              <w:t>129.0</w:t>
             </w:r>
           </w:p>
         </w:tc>
@@ -10746,7 +11543,7 @@
               <w:rPr>
                 <w:sz w:val="17"/>
               </w:rPr>
-              <w:t>138.3</w:t>
+              <w:t>161.1</w:t>
             </w:r>
           </w:p>
         </w:tc>
@@ -10763,7 +11560,7 @@
               <w:rPr>
                 <w:sz w:val="17"/>
               </w:rPr>
-              <w:t>155.4</w:t>
+              <w:t>181.0</w:t>
             </w:r>
           </w:p>
         </w:tc>
@@ -10780,7 +11577,7 @@
               <w:rPr>
                 <w:sz w:val="17"/>
               </w:rPr>
-              <w:t>175.9</w:t>
+              <w:t>204.9</w:t>
             </w:r>
           </w:p>
         </w:tc>
@@ -10797,7 +11594,7 @@
               <w:rPr>
                 <w:sz w:val="17"/>
               </w:rPr>
-              <w:t>190.6</w:t>
+              <w:t>222.0</w:t>
             </w:r>
           </w:p>
         </w:tc>
@@ -10814,7 +11611,7 @@
               <w:rPr>
                 <w:sz w:val="17"/>
               </w:rPr>
-              <w:t>204.8</w:t>
+              <w:t>238.5</w:t>
             </w:r>
           </w:p>
         </w:tc>
@@ -10850,7 +11647,7 @@
               <w:rPr>
                 <w:sz w:val="17"/>
               </w:rPr>
-              <w:t>65.9</w:t>
+              <w:t>76.7</w:t>
             </w:r>
           </w:p>
         </w:tc>
@@ -10867,7 +11664,7 @@
               <w:rPr>
                 <w:sz w:val="17"/>
               </w:rPr>
-              <w:t>82.3</w:t>
+              <w:t>95.8</w:t>
             </w:r>
           </w:p>
         </w:tc>
@@ -10884,7 +11681,7 @@
               <w:rPr>
                 <w:sz w:val="17"/>
               </w:rPr>
-              <w:t>92.4</w:t>
+              <w:t>107.6</w:t>
             </w:r>
           </w:p>
         </w:tc>
@@ -10901,7 +11698,7 @@
               <w:rPr>
                 <w:sz w:val="17"/>
               </w:rPr>
-              <w:t>104.6</w:t>
+              <w:t>121.8</w:t>
             </w:r>
           </w:p>
         </w:tc>
@@ -10918,7 +11715,7 @@
               <w:rPr>
                 <w:sz w:val="17"/>
               </w:rPr>
-              <w:t>113.3</w:t>
+              <w:t>132.0</w:t>
             </w:r>
           </w:p>
         </w:tc>
@@ -10935,7 +11732,7 @@
               <w:rPr>
                 <w:sz w:val="17"/>
               </w:rPr>
-              <w:t>121.8</w:t>
+              <w:t>141.8</w:t>
             </w:r>
           </w:p>
         </w:tc>
@@ -10971,7 +11768,7 @@
               <w:rPr>
                 <w:sz w:val="17"/>
               </w:rPr>
-              <w:t>39.2</w:t>
+              <w:t>45.6</w:t>
             </w:r>
           </w:p>
         </w:tc>
@@ -10988,7 +11785,7 @@
               <w:rPr>
                 <w:sz w:val="17"/>
               </w:rPr>
-              <w:t>48.9</w:t>
+              <w:t>57.0</w:t>
             </w:r>
           </w:p>
         </w:tc>
@@ -11005,7 +11802,7 @@
               <w:rPr>
                 <w:sz w:val="17"/>
               </w:rPr>
-              <w:t>54.9</w:t>
+              <w:t>64.0</w:t>
             </w:r>
           </w:p>
         </w:tc>
@@ -11022,7 +11819,7 @@
               <w:rPr>
                 <w:sz w:val="17"/>
               </w:rPr>
-              <w:t>62.2</w:t>
+              <w:t>72.4</w:t>
             </w:r>
           </w:p>
         </w:tc>
@@ -11039,7 +11836,7 @@
               <w:rPr>
                 <w:sz w:val="17"/>
               </w:rPr>
-              <w:t>67.4</w:t>
+              <w:t>78.5</w:t>
             </w:r>
           </w:p>
         </w:tc>
@@ -11056,7 +11853,7 @@
               <w:rPr>
                 <w:sz w:val="17"/>
               </w:rPr>
-              <w:t>72.4</w:t>
+              <w:t>84.3</w:t>
             </w:r>
           </w:p>
         </w:tc>
@@ -11092,7 +11889,7 @@
               <w:rPr>
                 <w:sz w:val="17"/>
               </w:rPr>
-              <w:t>23.3</w:t>
+              <w:t>27.1</w:t>
             </w:r>
           </w:p>
         </w:tc>
@@ -11109,7 +11906,7 @@
               <w:rPr>
                 <w:sz w:val="17"/>
               </w:rPr>
-              <w:t>29.1</w:t>
+              <w:t>33.9</w:t>
             </w:r>
           </w:p>
         </w:tc>
@@ -11126,7 +11923,7 @@
               <w:rPr>
                 <w:sz w:val="17"/>
               </w:rPr>
-              <w:t>32.7</w:t>
+              <w:t>38.0</w:t>
             </w:r>
           </w:p>
         </w:tc>
@@ -11143,7 +11940,7 @@
               <w:rPr>
                 <w:sz w:val="17"/>
               </w:rPr>
-              <w:t>37.0</w:t>
+              <w:t>43.1</w:t>
             </w:r>
           </w:p>
         </w:tc>
@@ -11160,7 +11957,7 @@
               <w:rPr>
                 <w:sz w:val="17"/>
               </w:rPr>
-              <w:t>40.1</w:t>
+              <w:t>46.7</w:t>
             </w:r>
           </w:p>
         </w:tc>
@@ -11177,7 +11974,7 @@
               <w:rPr>
                 <w:sz w:val="17"/>
               </w:rPr>
-              <w:t>43.1</w:t>
+              <w:t>50.1</w:t>
             </w:r>
           </w:p>
         </w:tc>
@@ -11213,7 +12010,7 @@
               <w:rPr>
                 <w:sz w:val="17"/>
               </w:rPr>
-              <w:t>10.2</w:t>
+              <w:t>11.9</w:t>
             </w:r>
           </w:p>
         </w:tc>
@@ -11230,7 +12027,7 @@
               <w:rPr>
                 <w:sz w:val="17"/>
               </w:rPr>
-              <w:t>12.8</w:t>
+              <w:t>14.9</w:t>
             </w:r>
           </w:p>
         </w:tc>
@@ -11247,7 +12044,7 @@
               <w:rPr>
                 <w:sz w:val="17"/>
               </w:rPr>
-              <w:t>14.3</w:t>
+              <w:t>16.7</w:t>
             </w:r>
           </w:p>
         </w:tc>
@@ -11264,7 +12061,7 @@
               <w:rPr>
                 <w:sz w:val="17"/>
               </w:rPr>
-              <w:t>16.2</w:t>
+              <w:t>18.9</w:t>
             </w:r>
           </w:p>
         </w:tc>
@@ -11281,7 +12078,7 @@
               <w:rPr>
                 <w:sz w:val="17"/>
               </w:rPr>
-              <w:t>17.6</w:t>
+              <w:t>20.5</w:t>
             </w:r>
           </w:p>
         </w:tc>
@@ -11298,7 +12095,7 @@
               <w:rPr>
                 <w:sz w:val="17"/>
               </w:rPr>
-              <w:t>18.9</w:t>
+              <w:t>22.0</w:t>
             </w:r>
           </w:p>
         </w:tc>
@@ -11334,7 +12131,7 @@
               <w:rPr>
                 <w:sz w:val="17"/>
               </w:rPr>
-              <w:t>6.1</w:t>
+              <w:t>7.1</w:t>
             </w:r>
           </w:p>
         </w:tc>
@@ -11351,7 +12148,7 @@
               <w:rPr>
                 <w:sz w:val="17"/>
               </w:rPr>
-              <w:t>7.6</w:t>
+              <w:t>8.8</w:t>
             </w:r>
           </w:p>
         </w:tc>
@@ -11368,7 +12165,7 @@
               <w:rPr>
                 <w:sz w:val="17"/>
               </w:rPr>
-              <w:t>8.5</w:t>
+              <w:t>9.9</w:t>
             </w:r>
           </w:p>
         </w:tc>
@@ -11385,7 +12182,7 @@
               <w:rPr>
                 <w:sz w:val="17"/>
               </w:rPr>
-              <w:t>9.6</w:t>
+              <w:t>11.2</w:t>
             </w:r>
           </w:p>
         </w:tc>
@@ -11402,7 +12199,7 @@
               <w:rPr>
                 <w:sz w:val="17"/>
               </w:rPr>
-              <w:t>10.4</w:t>
+              <w:t>12.2</w:t>
             </w:r>
           </w:p>
         </w:tc>
@@ -11419,7 +12216,7 @@
               <w:rPr>
                 <w:sz w:val="17"/>
               </w:rPr>
-              <w:t>11.2</w:t>
+              <w:t>13.1</w:t>
             </w:r>
           </w:p>
         </w:tc>
@@ -11450,7 +12247,7 @@
           <w:i/>
           <w:sz w:val="22"/>
         </w:rPr>
-        <w:t>I = 1419.77 · T^0.1315 / t^0.7500     (I en mm/h, T en años, t en minutos)</w:t>
+        <w:t>I = 1653.63 · T^0.1315 / t^0.7500     (I en mm/h, T en años, t en minutos)</w:t>
       </w:r>
     </w:p>
     <w:p>
@@ -11513,7 +12310,7 @@
           <w:b/>
           <w:sz w:val="18"/>
         </w:rPr>
-        <w:t>Tabla N° 09. Intensidad de diseño</w:t>
+        <w:t>Tabla N° 10. Intensidad de diseño</w:t>
       </w:r>
     </w:p>
     <w:tbl>
@@ -11599,7 +12396,7 @@
               <w:rPr>
                 <w:sz w:val="17"/>
               </w:rPr>
-              <w:t>231.49 mm</w:t>
+              <w:t>269.62 mm</w:t>
             </w:r>
           </w:p>
         </w:tc>
@@ -11635,7 +12432,7 @@
               <w:rPr>
                 <w:sz w:val="17"/>
               </w:rPr>
-              <w:t>66.83 mm</w:t>
+              <w:t>77.83 mm</w:t>
             </w:r>
           </w:p>
         </w:tc>
@@ -11671,7 +12468,7 @@
               <w:rPr>
                 <w:sz w:val="17"/>
               </w:rPr>
-              <w:t>400.96 mm/h</w:t>
+              <w:t>467.00 mm/h</w:t>
             </w:r>
           </w:p>
         </w:tc>
@@ -11710,7 +12507,7 @@
           <w:b/>
           <w:sz w:val="18"/>
         </w:rPr>
-        <w:t>Tabla N° 10. Superficies y coeficiente de escorrentía</w:t>
+        <w:t>Tabla N° 11. Superficies y coeficiente de escorrentía</w:t>
       </w:r>
     </w:p>
     <w:tbl>
@@ -12150,7 +12947,7 @@
           <w:b/>
           <w:sz w:val="18"/>
         </w:rPr>
-        <w:t>Tabla N° 11. Caudal máximo por eje (tramo final)</w:t>
+        <w:t>Tabla N° 12. Caudal máximo por eje (tramo final)</w:t>
       </w:r>
     </w:p>
     <w:tbl>
@@ -12347,7 +13144,7 @@
               <w:rPr>
                 <w:sz w:val="16"/>
               </w:rPr>
-              <w:t>24.9</w:t>
+              <w:t>29.0</w:t>
             </w:r>
           </w:p>
         </w:tc>
@@ -12434,7 +13231,7 @@
               <w:rPr>
                 <w:sz w:val="16"/>
               </w:rPr>
-              <w:t>178.4</w:t>
+              <w:t>207.7</w:t>
             </w:r>
           </w:p>
         </w:tc>
@@ -12521,7 +13318,7 @@
               <w:rPr>
                 <w:sz w:val="16"/>
               </w:rPr>
-              <w:t>16.6</w:t>
+              <w:t>19.3</w:t>
             </w:r>
           </w:p>
         </w:tc>
@@ -12608,7 +13405,7 @@
               <w:rPr>
                 <w:sz w:val="16"/>
               </w:rPr>
-              <w:t>63.6</w:t>
+              <w:t>74.1</w:t>
             </w:r>
           </w:p>
         </w:tc>
@@ -12695,7 +13492,7 @@
               <w:rPr>
                 <w:sz w:val="16"/>
               </w:rPr>
-              <w:t>40.1</w:t>
+              <w:t>46.7</w:t>
             </w:r>
           </w:p>
         </w:tc>
@@ -12782,7 +13579,7 @@
               <w:rPr>
                 <w:sz w:val="16"/>
               </w:rPr>
-              <w:t>8.8</w:t>
+              <w:t>10.3</w:t>
             </w:r>
           </w:p>
         </w:tc>
@@ -12869,7 +13666,7 @@
               <w:rPr>
                 <w:sz w:val="16"/>
               </w:rPr>
-              <w:t>149.6</w:t>
+              <w:t>174.2</w:t>
             </w:r>
           </w:p>
         </w:tc>
@@ -12956,7 +13753,7 @@
               <w:rPr>
                 <w:sz w:val="16"/>
               </w:rPr>
-              <w:t>24.7</w:t>
+              <w:t>28.8</w:t>
             </w:r>
           </w:p>
         </w:tc>
@@ -13043,7 +13840,7 @@
               <w:rPr>
                 <w:sz w:val="16"/>
               </w:rPr>
-              <w:t>19.6</w:t>
+              <w:t>22.8</w:t>
             </w:r>
           </w:p>
         </w:tc>
@@ -13130,7 +13927,7 @@
               <w:rPr>
                 <w:sz w:val="16"/>
               </w:rPr>
-              <w:t>27.0</w:t>
+              <w:t>31.4</w:t>
             </w:r>
           </w:p>
         </w:tc>
@@ -13217,7 +14014,7 @@
               <w:rPr>
                 <w:sz w:val="16"/>
               </w:rPr>
-              <w:t>22.7</w:t>
+              <w:t>26.4</w:t>
             </w:r>
           </w:p>
         </w:tc>
@@ -13304,7 +14101,7 @@
               <w:rPr>
                 <w:sz w:val="16"/>
               </w:rPr>
-              <w:t>227.3</w:t>
+              <w:t>264.7</w:t>
             </w:r>
           </w:p>
         </w:tc>
@@ -13391,7 +14188,7 @@
               <w:rPr>
                 <w:sz w:val="16"/>
               </w:rPr>
-              <w:t>16.2</w:t>
+              <w:t>18.9</w:t>
             </w:r>
           </w:p>
         </w:tc>
@@ -13478,7 +14275,7 @@
               <w:rPr>
                 <w:sz w:val="16"/>
               </w:rPr>
-              <w:t>60.8</w:t>
+              <w:t>70.8</w:t>
             </w:r>
           </w:p>
         </w:tc>
@@ -13565,7 +14362,7 @@
               <w:rPr>
                 <w:sz w:val="16"/>
               </w:rPr>
-              <w:t>44.2</w:t>
+              <w:t>51.5</w:t>
             </w:r>
           </w:p>
         </w:tc>
@@ -13652,7 +14449,7 @@
               <w:rPr>
                 <w:sz w:val="16"/>
               </w:rPr>
-              <w:t>41.2</w:t>
+              <w:t>48.0</w:t>
             </w:r>
           </w:p>
         </w:tc>
@@ -13739,7 +14536,7 @@
               <w:rPr>
                 <w:sz w:val="16"/>
               </w:rPr>
-              <w:t>41.6</w:t>
+              <w:t>48.4</w:t>
             </w:r>
           </w:p>
         </w:tc>
@@ -13826,7 +14623,7 @@
               <w:rPr>
                 <w:sz w:val="16"/>
               </w:rPr>
-              <w:t>18.9</w:t>
+              <w:t>22.0</w:t>
             </w:r>
           </w:p>
         </w:tc>
@@ -13913,7 +14710,7 @@
               <w:rPr>
                 <w:sz w:val="16"/>
               </w:rPr>
-              <w:t>4.9</w:t>
+              <w:t>5.7</w:t>
             </w:r>
           </w:p>
         </w:tc>
@@ -13991,7 +14788,7 @@
           <w:b/>
           <w:sz w:val="18"/>
         </w:rPr>
-        <w:t>Tabla N° 12. Verificación hidráulica por eje (tramo más cargado)</w:t>
+        <w:t>Tabla N° 13. Verificación hidráulica por eje (tramo más cargado)</w:t>
       </w:r>
     </w:p>
     <w:tbl>
@@ -14197,7 +14994,7 @@
               <w:rPr>
                 <w:sz w:val="16"/>
               </w:rPr>
-              <w:t>24.9</w:t>
+              <w:t>29.0</w:t>
             </w:r>
           </w:p>
         </w:tc>
@@ -14231,7 +15028,7 @@
               <w:rPr>
                 <w:sz w:val="16"/>
               </w:rPr>
-              <w:t>0.086</w:t>
+              <w:t>0.096</w:t>
             </w:r>
           </w:p>
         </w:tc>
@@ -14265,7 +15062,7 @@
               <w:rPr>
                 <w:sz w:val="16"/>
               </w:rPr>
-              <w:t>0.217</w:t>
+              <w:t>0.208</w:t>
             </w:r>
           </w:p>
         </w:tc>
@@ -14282,7 +15079,7 @@
               <w:rPr>
                 <w:sz w:val="16"/>
               </w:rPr>
-              <w:t>0.80</w:t>
+              <w:t>0.84</w:t>
             </w:r>
           </w:p>
         </w:tc>
@@ -14335,7 +15132,7 @@
               <w:rPr>
                 <w:sz w:val="16"/>
               </w:rPr>
-              <w:t>178.4</w:t>
+              <w:t>207.7</w:t>
             </w:r>
           </w:p>
         </w:tc>
@@ -14369,7 +15166,7 @@
               <w:rPr>
                 <w:sz w:val="16"/>
               </w:rPr>
-              <w:t>0.369</w:t>
+              <w:t>0.418</w:t>
             </w:r>
           </w:p>
         </w:tc>
@@ -14403,7 +15200,7 @@
               <w:rPr>
                 <w:sz w:val="16"/>
               </w:rPr>
-              <w:t>0.230</w:t>
+              <w:t>0.222</w:t>
             </w:r>
           </w:p>
         </w:tc>
@@ -14420,7 +15217,7 @@
               <w:rPr>
                 <w:sz w:val="16"/>
               </w:rPr>
-              <w:t>1.73</w:t>
+              <w:t>1.82</w:t>
             </w:r>
           </w:p>
         </w:tc>
@@ -14473,7 +15270,7 @@
               <w:rPr>
                 <w:sz w:val="16"/>
               </w:rPr>
-              <w:t>16.6</w:t>
+              <w:t>19.3</w:t>
             </w:r>
           </w:p>
         </w:tc>
@@ -14507,7 +15304,7 @@
               <w:rPr>
                 <w:sz w:val="16"/>
               </w:rPr>
-              <w:t>0.065</w:t>
+              <w:t>0.073</w:t>
             </w:r>
           </w:p>
         </w:tc>
@@ -14541,7 +15338,7 @@
               <w:rPr>
                 <w:sz w:val="16"/>
               </w:rPr>
-              <w:t>0.235</w:t>
+              <w:t>0.227</w:t>
             </w:r>
           </w:p>
         </w:tc>
@@ -14558,7 +15355,7 @@
               <w:rPr>
                 <w:sz w:val="16"/>
               </w:rPr>
-              <w:t>0.70</w:t>
+              <w:t>0.73</w:t>
             </w:r>
           </w:p>
         </w:tc>
@@ -14611,7 +15408,7 @@
               <w:rPr>
                 <w:sz w:val="16"/>
               </w:rPr>
-              <w:t>63.6</w:t>
+              <w:t>74.1</w:t>
             </w:r>
           </w:p>
         </w:tc>
@@ -14645,7 +15442,7 @@
               <w:rPr>
                 <w:sz w:val="16"/>
               </w:rPr>
-              <w:t>0.167</w:t>
+              <w:t>0.187</w:t>
             </w:r>
           </w:p>
         </w:tc>
@@ -14679,7 +15476,7 @@
               <w:rPr>
                 <w:sz w:val="16"/>
               </w:rPr>
-              <w:t>0.217</w:t>
+              <w:t>0.208</w:t>
             </w:r>
           </w:p>
         </w:tc>
@@ -14696,7 +15493,7 @@
               <w:rPr>
                 <w:sz w:val="16"/>
               </w:rPr>
-              <w:t>1.06</w:t>
+              <w:t>1.10</w:t>
             </w:r>
           </w:p>
         </w:tc>
@@ -14749,7 +15546,7 @@
               <w:rPr>
                 <w:sz w:val="16"/>
               </w:rPr>
-              <w:t>40.1</w:t>
+              <w:t>46.7</w:t>
             </w:r>
           </w:p>
         </w:tc>
@@ -14783,7 +15580,7 @@
               <w:rPr>
                 <w:sz w:val="16"/>
               </w:rPr>
-              <w:t>0.120</w:t>
+              <w:t>0.133</w:t>
             </w:r>
           </w:p>
         </w:tc>
@@ -14817,7 +15614,7 @@
               <w:rPr>
                 <w:sz w:val="16"/>
               </w:rPr>
-              <w:t>0.233</w:t>
+              <w:t>0.226</w:t>
             </w:r>
           </w:p>
         </w:tc>
@@ -14834,7 +15631,7 @@
               <w:rPr>
                 <w:sz w:val="16"/>
               </w:rPr>
-              <w:t>0.93</w:t>
+              <w:t>0.97</w:t>
             </w:r>
           </w:p>
         </w:tc>
@@ -14887,7 +15684,7 @@
               <w:rPr>
                 <w:sz w:val="16"/>
               </w:rPr>
-              <w:t>8.8</w:t>
+              <w:t>10.3</w:t>
             </w:r>
           </w:p>
         </w:tc>
@@ -14921,7 +15718,7 @@
               <w:rPr>
                 <w:sz w:val="16"/>
               </w:rPr>
-              <w:t>0.043</w:t>
+              <w:t>0.048</w:t>
             </w:r>
           </w:p>
         </w:tc>
@@ -14955,7 +15752,7 @@
               <w:rPr>
                 <w:sz w:val="16"/>
               </w:rPr>
-              <w:t>0.257</w:t>
+              <w:t>0.252</w:t>
             </w:r>
           </w:p>
         </w:tc>
@@ -14972,7 +15769,7 @@
               <w:rPr>
                 <w:sz w:val="16"/>
               </w:rPr>
-              <w:t>0.56</w:t>
+              <w:t>0.59</w:t>
             </w:r>
           </w:p>
         </w:tc>
@@ -15025,7 +15822,7 @@
               <w:rPr>
                 <w:sz w:val="16"/>
               </w:rPr>
-              <w:t>149.6</w:t>
+              <w:t>174.2</w:t>
             </w:r>
           </w:p>
         </w:tc>
@@ -15059,7 +15856,7 @@
               <w:rPr>
                 <w:sz w:val="16"/>
               </w:rPr>
-              <w:t>0.320</w:t>
+              <w:t>0.362</w:t>
             </w:r>
           </w:p>
         </w:tc>
@@ -15093,7 +15890,7 @@
               <w:rPr>
                 <w:sz w:val="16"/>
               </w:rPr>
-              <w:t>0.270</w:t>
+              <w:t>0.267</w:t>
             </w:r>
           </w:p>
         </w:tc>
@@ -15110,7 +15907,7 @@
               <w:rPr>
                 <w:sz w:val="16"/>
               </w:rPr>
-              <w:t>1.31</w:t>
+              <w:t>1.35</w:t>
             </w:r>
           </w:p>
         </w:tc>
@@ -15163,7 +15960,7 @@
               <w:rPr>
                 <w:sz w:val="16"/>
               </w:rPr>
-              <w:t>24.7</w:t>
+              <w:t>28.8</w:t>
             </w:r>
           </w:p>
         </w:tc>
@@ -15197,7 +15994,7 @@
               <w:rPr>
                 <w:sz w:val="16"/>
               </w:rPr>
-              <w:t>0.086</w:t>
+              <w:t>0.095</w:t>
             </w:r>
           </w:p>
         </w:tc>
@@ -15231,7 +16028,7 @@
               <w:rPr>
                 <w:sz w:val="16"/>
               </w:rPr>
-              <w:t>0.233</w:t>
+              <w:t>0.224</w:t>
             </w:r>
           </w:p>
         </w:tc>
@@ -15248,7 +16045,7 @@
               <w:rPr>
                 <w:sz w:val="16"/>
               </w:rPr>
-              <w:t>0.80</w:t>
+              <w:t>0.84</w:t>
             </w:r>
           </w:p>
         </w:tc>
@@ -15301,7 +16098,7 @@
               <w:rPr>
                 <w:sz w:val="16"/>
               </w:rPr>
-              <w:t>19.6</w:t>
+              <w:t>22.8</w:t>
             </w:r>
           </w:p>
         </w:tc>
@@ -15335,7 +16132,7 @@
               <w:rPr>
                 <w:sz w:val="16"/>
               </w:rPr>
-              <w:t>0.073</w:t>
+              <w:t>0.081</w:t>
             </w:r>
           </w:p>
         </w:tc>
@@ -15369,7 +16166,7 @@
               <w:rPr>
                 <w:sz w:val="16"/>
               </w:rPr>
-              <w:t>0.227</w:t>
+              <w:t>0.219</w:t>
             </w:r>
           </w:p>
         </w:tc>
@@ -15386,7 +16183,7 @@
               <w:rPr>
                 <w:sz w:val="16"/>
               </w:rPr>
-              <w:t>0.74</w:t>
+              <w:t>0.77</w:t>
             </w:r>
           </w:p>
         </w:tc>
@@ -15439,7 +16236,7 @@
               <w:rPr>
                 <w:sz w:val="16"/>
               </w:rPr>
-              <w:t>27.0</w:t>
+              <w:t>31.4</w:t>
             </w:r>
           </w:p>
         </w:tc>
@@ -15473,7 +16270,7 @@
               <w:rPr>
                 <w:sz w:val="16"/>
               </w:rPr>
-              <w:t>0.091</w:t>
+              <w:t>0.101</w:t>
             </w:r>
           </w:p>
         </w:tc>
@@ -15507,7 +16304,7 @@
               <w:rPr>
                 <w:sz w:val="16"/>
               </w:rPr>
-              <w:t>0.238</w:t>
+              <w:t>0.231</w:t>
             </w:r>
           </w:p>
         </w:tc>
@@ -15524,7 +16321,7 @@
               <w:rPr>
                 <w:sz w:val="16"/>
               </w:rPr>
-              <w:t>0.82</w:t>
+              <w:t>0.86</w:t>
             </w:r>
           </w:p>
         </w:tc>
@@ -15577,7 +16374,7 @@
               <w:rPr>
                 <w:sz w:val="16"/>
               </w:rPr>
-              <w:t>22.7</w:t>
+              <w:t>26.4</w:t>
             </w:r>
           </w:p>
         </w:tc>
@@ -15611,7 +16408,7 @@
               <w:rPr>
                 <w:sz w:val="16"/>
               </w:rPr>
-              <w:t>0.081</w:t>
+              <w:t>0.090</w:t>
             </w:r>
           </w:p>
         </w:tc>
@@ -15645,7 +16442,7 @@
               <w:rPr>
                 <w:sz w:val="16"/>
               </w:rPr>
-              <w:t>0.119</w:t>
+              <w:t>0.110</w:t>
             </w:r>
           </w:p>
         </w:tc>
@@ -15662,7 +16459,7 @@
               <w:rPr>
                 <w:sz w:val="16"/>
               </w:rPr>
-              <w:t>0.77</w:t>
+              <w:t>0.81</w:t>
             </w:r>
           </w:p>
         </w:tc>
@@ -15715,7 +16512,7 @@
               <w:rPr>
                 <w:sz w:val="16"/>
               </w:rPr>
-              <w:t>227.3</w:t>
+              <w:t>264.7</w:t>
             </w:r>
           </w:p>
         </w:tc>
@@ -15749,7 +16546,7 @@
               <w:rPr>
                 <w:sz w:val="16"/>
               </w:rPr>
-              <w:t>0.450</w:t>
+              <w:t>0.512</w:t>
             </w:r>
           </w:p>
         </w:tc>
@@ -15783,7 +16580,7 @@
               <w:rPr>
                 <w:sz w:val="16"/>
               </w:rPr>
-              <w:t>0.186</w:t>
+              <w:t>0.128</w:t>
             </w:r>
           </w:p>
         </w:tc>
@@ -15800,7 +16597,7 @@
               <w:rPr>
                 <w:sz w:val="16"/>
               </w:rPr>
-              <w:t>1.42</w:t>
+              <w:t>1.46</w:t>
             </w:r>
           </w:p>
         </w:tc>
@@ -15853,7 +16650,7 @@
               <w:rPr>
                 <w:sz w:val="16"/>
               </w:rPr>
-              <w:t>16.2</w:t>
+              <w:t>18.9</w:t>
             </w:r>
           </w:p>
         </w:tc>
@@ -15887,7 +16684,7 @@
               <w:rPr>
                 <w:sz w:val="16"/>
               </w:rPr>
-              <w:t>0.064</w:t>
+              <w:t>0.071</w:t>
             </w:r>
           </w:p>
         </w:tc>
@@ -15921,7 +16718,7 @@
               <w:rPr>
                 <w:sz w:val="16"/>
               </w:rPr>
-              <w:t>0.236</w:t>
+              <w:t>0.229</w:t>
             </w:r>
           </w:p>
         </w:tc>
@@ -15938,7 +16735,7 @@
               <w:rPr>
                 <w:sz w:val="16"/>
               </w:rPr>
-              <w:t>0.69</w:t>
+              <w:t>0.73</w:t>
             </w:r>
           </w:p>
         </w:tc>
@@ -15991,7 +16788,7 @@
               <w:rPr>
                 <w:sz w:val="16"/>
               </w:rPr>
-              <w:t>60.8</w:t>
+              <w:t>70.8</w:t>
             </w:r>
           </w:p>
         </w:tc>
@@ -16025,7 +16822,7 @@
               <w:rPr>
                 <w:sz w:val="16"/>
               </w:rPr>
-              <w:t>0.161</w:t>
+              <w:t>0.181</w:t>
             </w:r>
           </w:p>
         </w:tc>
@@ -16059,7 +16856,7 @@
               <w:rPr>
                 <w:sz w:val="16"/>
               </w:rPr>
-              <w:t>0.197</w:t>
+              <w:t>0.179</w:t>
             </w:r>
           </w:p>
         </w:tc>
@@ -16076,7 +16873,7 @@
               <w:rPr>
                 <w:sz w:val="16"/>
               </w:rPr>
-              <w:t>1.05</w:t>
+              <w:t>1.09</w:t>
             </w:r>
           </w:p>
         </w:tc>
@@ -16129,7 +16926,7 @@
               <w:rPr>
                 <w:sz w:val="16"/>
               </w:rPr>
-              <w:t>44.2</w:t>
+              <w:t>51.5</w:t>
             </w:r>
           </w:p>
         </w:tc>
@@ -16163,7 +16960,7 @@
               <w:rPr>
                 <w:sz w:val="16"/>
               </w:rPr>
-              <w:t>0.128</w:t>
+              <w:t>0.143</w:t>
             </w:r>
           </w:p>
         </w:tc>
@@ -16197,7 +16994,7 @@
               <w:rPr>
                 <w:sz w:val="16"/>
               </w:rPr>
-              <w:t>0.222</w:t>
+              <w:t>0.207</w:t>
             </w:r>
           </w:p>
         </w:tc>
@@ -16214,7 +17011,7 @@
               <w:rPr>
                 <w:sz w:val="16"/>
               </w:rPr>
-              <w:t>0.99</w:t>
+              <w:t>1.03</w:t>
             </w:r>
           </w:p>
         </w:tc>
@@ -16267,7 +17064,7 @@
               <w:rPr>
                 <w:sz w:val="16"/>
               </w:rPr>
-              <w:t>41.2</w:t>
+              <w:t>48.0</w:t>
             </w:r>
           </w:p>
         </w:tc>
@@ -16301,7 +17098,7 @@
               <w:rPr>
                 <w:sz w:val="16"/>
               </w:rPr>
-              <w:t>0.122</w:t>
+              <w:t>0.136</w:t>
             </w:r>
           </w:p>
         </w:tc>
@@ -16335,7 +17132,7 @@
               <w:rPr>
                 <w:sz w:val="16"/>
               </w:rPr>
-              <w:t>0.208</w:t>
+              <w:t>0.198</w:t>
             </w:r>
           </w:p>
         </w:tc>
@@ -16352,7 +17149,7 @@
               <w:rPr>
                 <w:sz w:val="16"/>
               </w:rPr>
-              <w:t>0.93</w:t>
+              <w:t>0.98</w:t>
             </w:r>
           </w:p>
         </w:tc>
@@ -16405,7 +17202,7 @@
               <w:rPr>
                 <w:sz w:val="16"/>
               </w:rPr>
-              <w:t>41.6</w:t>
+              <w:t>48.4</w:t>
             </w:r>
           </w:p>
         </w:tc>
@@ -16439,7 +17236,7 @@
               <w:rPr>
                 <w:sz w:val="16"/>
               </w:rPr>
-              <w:t>0.123</w:t>
+              <w:t>0.137</w:t>
             </w:r>
           </w:p>
         </w:tc>
@@ -16473,7 +17270,7 @@
               <w:rPr>
                 <w:sz w:val="16"/>
               </w:rPr>
-              <w:t>0.120</w:t>
+              <w:t>0.112</w:t>
             </w:r>
           </w:p>
         </w:tc>
@@ -16490,7 +17287,7 @@
               <w:rPr>
                 <w:sz w:val="16"/>
               </w:rPr>
-              <w:t>0.94</w:t>
+              <w:t>0.98</w:t>
             </w:r>
           </w:p>
         </w:tc>
@@ -16543,7 +17340,7 @@
               <w:rPr>
                 <w:sz w:val="16"/>
               </w:rPr>
-              <w:t>18.9</w:t>
+              <w:t>22.0</w:t>
             </w:r>
           </w:p>
         </w:tc>
@@ -16577,7 +17374,7 @@
               <w:rPr>
                 <w:sz w:val="16"/>
               </w:rPr>
-              <w:t>0.071</w:t>
+              <w:t>0.079</w:t>
             </w:r>
           </w:p>
         </w:tc>
@@ -16611,7 +17408,7 @@
               <w:rPr>
                 <w:sz w:val="16"/>
               </w:rPr>
-              <w:t>0.264</w:t>
+              <w:t>0.260</w:t>
             </w:r>
           </w:p>
         </w:tc>
@@ -16628,7 +17425,7 @@
               <w:rPr>
                 <w:sz w:val="16"/>
               </w:rPr>
-              <w:t>0.73</w:t>
+              <w:t>0.77</w:t>
             </w:r>
           </w:p>
         </w:tc>
@@ -16681,7 +17478,7 @@
               <w:rPr>
                 <w:sz w:val="16"/>
               </w:rPr>
-              <w:t>4.9</w:t>
+              <w:t>5.7</w:t>
             </w:r>
           </w:p>
         </w:tc>
@@ -16715,7 +17512,7 @@
               <w:rPr>
                 <w:sz w:val="16"/>
               </w:rPr>
-              <w:t>0.030</w:t>
+              <w:t>0.033</w:t>
             </w:r>
           </w:p>
         </w:tc>
@@ -16749,7 +17546,7 @@
               <w:rPr>
                 <w:sz w:val="16"/>
               </w:rPr>
-              <w:t>0.270</w:t>
+              <w:t>0.267</w:t>
             </w:r>
           </w:p>
         </w:tc>
@@ -16766,7 +17563,7 @@
               <w:rPr>
                 <w:sz w:val="16"/>
               </w:rPr>
-              <w:t>0.45</w:t>
+              <w:t>0.48</w:t>
             </w:r>
           </w:p>
         </w:tc>
@@ -16802,7 +17599,7 @@
         <w:rPr>
           <w:i w:val="0"/>
         </w:rPr>
-        <w:t>Todos los tramos cumplen: el caudal máximo es 227.3 l/s, el menor borde libre es 0.119 m y la velocidad máxima es 1.73 m/s. Por lo tanto, la sección de 0.60 m de ancho total con 0.40 m libres se mantiene en toda la red; solo varía la profundidad (0.30 m a 0.91 m) para seguir la pendiente de la cota de fondo con el borde al ras del piso.</w:t>
+        <w:t>Todos los tramos cumplen: el caudal máximo es 264.7 l/s, el menor borde libre es 0.110 m y la velocidad máxima es 1.82 m/s. Por lo tanto, la sección de 0.60 m de ancho total con 0.40 m libres se mantiene en toda la red; solo varía la profundidad (0.30 m a 0.91 m) para seguir la pendiente de la cota de fondo con el borde al ras del piso.</w:t>
       </w:r>
     </w:p>
     <w:p>
@@ -16814,7 +17611,7 @@
           <w:b/>
           <w:sz w:val="18"/>
         </w:rPr>
-        <w:t>Tabla N° 13. Comprobaciones del diseño</w:t>
+        <w:t>Tabla N° 14. Comprobaciones del diseño</w:t>
       </w:r>
     </w:p>
     <w:tbl>
@@ -17506,7 +18303,7 @@
           <w:b/>
           <w:sz w:val="18"/>
         </w:rPr>
-        <w:t>Tabla N° 14. Descargas de la red de cunetas</w:t>
+        <w:t>Tabla N° 15. Descargas de la red de cunetas</w:t>
       </w:r>
     </w:p>
     <w:tbl>
@@ -18034,7 +18831,7 @@
         <w:jc w:val="both"/>
       </w:pPr>
       <w:r>
-        <w:t>La precipitación máxima en 24 horas de diseño es 231.49 mm (T = 25 años, distribución Log-Normal), obtenida de la serie de la estación CO Tarapoto transpuesta a Barranquita con un factor de 1.901.</w:t>
+        <w:t>La precipitación máxima en 24 horas de diseño es 269.62 mm (T = 25 años, distribución Log-Normal), obtenida de la serie de la estación CO Tarapoto transpuesta a Barranquita con un factor de 2.214.</w:t>
       </w:r>
     </w:p>
     <w:p>
@@ -18043,7 +18840,7 @@
         <w:jc w:val="both"/>
       </w:pPr>
       <w:r>
-        <w:t>La intensidad de diseño para tc = 10 minutos es 400.96 mm/h (Dick y Peschke).</w:t>
+        <w:t>La intensidad de diseño para tc = 10 minutos es 467.00 mm/h (Dick y Peschke).</w:t>
       </w:r>
     </w:p>
     <w:p>
@@ -18061,7 +18858,7 @@
         <w:jc w:val="both"/>
       </w:pPr>
       <w:r>
-        <w:t>Las cunetas de 0.60 m de ancho total (0.40 m libres) cumplen en todos los tramos con el caudal de diseño (máximo 227.3 l/s), con borde libre mínimo de 0.119 m y velocidad máxima de 1.73 m/s.</w:t>
+        <w:t>Las cunetas de 0.60 m de ancho total (0.40 m libres) cumplen en todos los tramos con el caudal de diseño (máximo 264.7 l/s), con borde libre mínimo de 0.110 m y velocidad máxima de 1.82 m/s.</w:t>
       </w:r>
     </w:p>
     <w:p>
@@ -18088,7 +18885,7 @@
         <w:jc w:val="both"/>
       </w:pPr>
       <w:r>
-        <w:t>Si el SENAMHI pone a disposición la serie de precipitación máxima en 24 horas de la estación Pongo de Caynarachi, conviene contrastarla con la serie transpuesta.</w:t>
+        <w:t>Si el SENAMHI pone a disposición la serie de precipitación máxima en 24 horas de las estaciones Navarro, Pelejo o Shanusi, conviene contrastarla con la serie transpuesta.</w:t>
       </w:r>
     </w:p>
     <w:p>

</xml_diff>